<commit_message>
change to acm format
</commit_message>
<xml_diff>
--- a/llm-uml-antipatterns.docx
+++ b/llm-uml-antipatterns.docx
@@ -7,28 +7,14 @@
         <w:pStyle w:val="Title"/>
       </w:pPr>
       <w:r>
-        <w:t xml:space="preserve"> </w:t>
-      </w:r>
-      <w:r>
-        <w:rPr>
-          <w:b/>
-          <w:bCs/>
-        </w:rPr>
         <w:t xml:space="preserve">LLM-Based Antipattern Detection in UML Use Case Models:</w:t>
       </w:r>
       <w:r>
         <w:br/>
       </w:r>
       <w:r>
-        <w:rPr>
-          <w:b/>
-          <w:bCs/>
-        </w:rPr>
         <w:t xml:space="preserve">A Synthetic Data Generation and Fine-Tuning Approach</w:t>
       </w:r>
-      <w:r>
-        <w:t xml:space="preserve"> </w:t>
-      </w:r>
     </w:p>
     <w:p>
       <w:pPr>
@@ -37,27 +23,6 @@
       <w:r>
         <w:t xml:space="preserve">Yasser Khan</w:t>
       </w:r>
-      <w:r>
-        <w:br/>
-      </w:r>
-      <w:r>
-        <w:t xml:space="preserve">Department of Electrical Engineering and Computer Science</w:t>
-      </w:r>
-      <w:r>
-        <w:br/>
-      </w:r>
-      <w:r>
-        <w:t xml:space="preserve">Florida Atlantic University, Florida, USA</w:t>
-      </w:r>
-      <w:r>
-        <w:br/>
-      </w:r>
-      <w:r>
-        <w:rPr>
-          <w:rStyle w:val="VerbatimChar"/>
-        </w:rPr>
-        <w:t xml:space="preserve">khany2026@fau.edu</w:t>
-      </w:r>
     </w:p>
     <w:p>
       <w:pPr>
@@ -65,27 +30,6 @@
       </w:pPr>
       <w:r>
         <w:t xml:space="preserve">Mohamed El-Attar</w:t>
-      </w:r>
-      <w:r>
-        <w:br/>
-      </w:r>
-      <w:r>
-        <w:t xml:space="preserve">College of Technological Innovation</w:t>
-      </w:r>
-      <w:r>
-        <w:br/>
-      </w:r>
-      <w:r>
-        <w:t xml:space="preserve">Zayed University, Abu Dhabi, United Arab Emirates</w:t>
-      </w:r>
-      <w:r>
-        <w:br/>
-      </w:r>
-      <w:r>
-        <w:rPr>
-          <w:rStyle w:val="VerbatimChar"/>
-        </w:rPr>
-        <w:t xml:space="preserve">Mohamed.El-Attar@zu.ac.ae</w:t>
       </w:r>
     </w:p>
     <w:p>
@@ -205,37 +149,6 @@
       </w:r>
       <w:r>
         <w:t xml:space="preserve">91.0% detection accuracy and an instance-level recall of 0.87 on a held-out, domain-stratified test set. The paper details the full pipeline from synthetic data generation to fine-tuning and evaluation.</w:t>
-      </w:r>
-    </w:p>
-    <w:p>
-      <w:pPr>
-        <w:pStyle w:val="FirstParagraph"/>
-      </w:pPr>
-      <w:r>
-        <w:rPr>
-          <w:b/>
-          <w:bCs/>
-        </w:rPr>
-        <w:t xml:space="preserve">Keywords:</w:t>
-      </w:r>
-      <w:r>
-        <w:t xml:space="preserve"> </w:t>
-      </w:r>
-      <w:r>
-        <w:t xml:space="preserve">UML, use case diagrams, antipattern detection,</w:t>
-      </w:r>
-      <w:r>
-        <w:t xml:space="preserve"> </w:t>
-      </w:r>
-      <w:r>
-        <w:t xml:space="preserve">LLM, fine-tuning, synthetic data, PlantUML, LoRA.</w:t>
-      </w:r>
-    </w:p>
-    <w:p>
-      <w:r>
-        <w:pict>
-          <v:rect style="width:0;height:1.5pt" o:hralign="center" o:hrstd="t" o:hr="t"/>
-        </w:pict>
       </w:r>
     </w:p>
     <w:bookmarkStart w:id="9" w:name="sec:intro"/>

</xml_diff>

<commit_message>
update figure 4 caption
</commit_message>
<xml_diff>
--- a/llm-uml-antipatterns.docx
+++ b/llm-uml-antipatterns.docx
@@ -4836,7 +4836,7 @@
         <w:pStyle w:val="ImageCaption"/>
       </w:pPr>
       <w:r>
-        <w:t xml:space="preserve">MAPSTEDI subsystem UC diagram used as the real-world evaluation input.</w:t>
+        <w:t xml:space="preserve">MAPSTEDI subsystem use case diagram used as the real-world evaluation input.</w:t>
       </w:r>
     </w:p>
     <w:bookmarkEnd w:id="46"/>
@@ -4859,7 +4859,7 @@
         <w:t xml:space="preserve"> </w:t>
       </w:r>
       <w:r>
-        <w:t xml:space="preserve">shows the UC diagram. The three ground-truth</w:t>
+        <w:t xml:space="preserve">shows the use case diagram. The three ground-truth</w:t>
       </w:r>
       <w:r>
         <w:t xml:space="preserve"> </w:t>

</xml_diff>